<commit_message>
Adicionando: Regras e Modelo Bolsa Familia
</commit_message>
<xml_diff>
--- a/assets/templates/bpc_deficiencia.docx
+++ b/assets/templates/bpc_deficiencia.docx
@@ -147,16 +147,7 @@
           <w:sz w:val="24"/>
           <w:szCs w:val="24"/>
         </w:rPr>
-        <w:t>{{ e</w:t>
-      </w:r>
-      <w:bookmarkStart w:id="0" w:name="_GoBack"/>
-      <w:bookmarkEnd w:id="0"/>
-      <w:r>
-        <w:rPr>
-          <w:sz w:val="24"/>
-          <w:szCs w:val="24"/>
-        </w:rPr>
-        <w:t xml:space="preserve">stado_civil_cliente }}, </w:t>
+        <w:t xml:space="preserve">{{ estado_civil_cliente }}, </w:t>
       </w:r>
       <w:r>
         <w:rPr>
@@ -1040,7 +1031,18 @@
           <w:szCs w:val="24"/>
           <w:shd w:val="clear" w:color="auto" w:fill="FFFFFF"/>
         </w:rPr>
-        <w:t xml:space="preserve">Nesse sentido, considerando o reconhecimento de deficiência à pessoa com TEA, requer o acolhimento do respectivo pedido supra, com a devida anotação nos registros processuais, de modo a assegurar o tratamento célere e diferenciado à parte autora, como forma de garantir a efetividade do acesso à justiça e à proteção integral de seus direitos fundamentais. </w:t>
+        <w:t xml:space="preserve">Nesse sentido, considerando o reconhecimento de deficiência à pessoa com </w:t>
+      </w:r>
+      <w:r>
+        <w:t>{{ sigla_doenca }}</w:t>
+      </w:r>
+      <w:r>
+        <w:rPr>
+          <w:sz w:val="24"/>
+          <w:szCs w:val="24"/>
+          <w:shd w:val="clear" w:color="auto" w:fill="FFFFFF"/>
+        </w:rPr>
+        <w:t xml:space="preserve">, requer o acolhimento do respectivo pedido supra, com a devida anotação nos registros processuais, de modo a assegurar o tratamento célere e diferenciado à parte autora, como forma de garantir a efetividade do acesso à justiça e à proteção integral de seus direitos fundamentais. </w:t>
       </w:r>
     </w:p>
     <w:p>
@@ -1379,7 +1381,7 @@
           <w:szCs w:val="24"/>
         </w:rPr>
       </w:pPr>
-      <w:bookmarkStart w:id="1" w:name="_Hlk217633236"/>
+      <w:bookmarkStart w:id="0" w:name="_Hlk217633236"/>
       <w:r>
         <w:rPr>
           <w:sz w:val="24"/>
@@ -1423,7 +1425,7 @@
         </w:rPr>
         <w:t>O perigo de dano se configura pelo fato de que, se continuar sem receber o benefício, a autora terá sua subsistência prejudicada, uma vez que o benefício tem caráter alimentar.</w:t>
       </w:r>
-      <w:bookmarkEnd w:id="1"/>
+      <w:bookmarkEnd w:id="0"/>
     </w:p>
     <w:p>
       <w:pPr>
@@ -1601,9 +1603,19 @@
           <w:sz w:val="24"/>
           <w:szCs w:val="24"/>
         </w:rPr>
-        <w:lastRenderedPageBreak/>
         <w:t xml:space="preserve">A causa em questão busca a concessão do benefício de prestação continuada à pessoa com deficiência, com </w:t>
       </w:r>
+      <w:r>
+        <w:rPr>
+          <w:b/>
+          <w:bCs/>
+          <w:sz w:val="24"/>
+          <w:szCs w:val="24"/>
+        </w:rPr>
+        <w:t xml:space="preserve">DER </w:t>
+      </w:r>
+      <w:bookmarkStart w:id="1" w:name="_GoBack"/>
+      <w:bookmarkEnd w:id="1"/>
       <w:r>
         <w:rPr>
           <w:b/>
@@ -2084,35 +2096,7 @@
           <w:sz w:val="24"/>
           <w:szCs w:val="24"/>
         </w:rPr>
-        <w:t>o(</w:t>
-      </w:r>
-      <w:r>
-        <w:rPr>
-          <w:sz w:val="24"/>
-          <w:szCs w:val="24"/>
-        </w:rPr>
-        <w:t>a</w:t>
-      </w:r>
-      <w:r>
-        <w:rPr>
-          <w:sz w:val="24"/>
-          <w:szCs w:val="24"/>
-        </w:rPr>
-        <w:t>)</w:t>
-      </w:r>
-      <w:r>
-        <w:rPr>
-          <w:sz w:val="24"/>
-          <w:szCs w:val="24"/>
-        </w:rPr>
-        <w:t xml:space="preserve"> </w:t>
-      </w:r>
-      <w:r>
-        <w:rPr>
-          <w:sz w:val="24"/>
-          <w:szCs w:val="24"/>
-        </w:rPr>
-        <w:t>menor</w:t>
+        <w:t>a parte Autora</w:t>
       </w:r>
       <w:r>
         <w:rPr>
@@ -2171,6 +2155,7 @@
           <w:rFonts w:ascii="Arial" w:hAnsi="Arial" w:cs="Arial"/>
           <w:noProof/>
         </w:rPr>
+        <w:lastRenderedPageBreak/>
         <mc:AlternateContent>
           <mc:Choice Requires="wps">
             <w:drawing>
@@ -2301,7 +2286,6 @@
           <w:sz w:val="24"/>
           <w:szCs w:val="24"/>
         </w:rPr>
-        <w:lastRenderedPageBreak/>
         <w:tab/>
       </w:r>
     </w:p>
@@ -2674,41 +2658,13 @@
           <w:lang w:val="pt-BR"/>
         </w:rPr>
       </w:pPr>
-      <w:proofErr w:type="gramStart"/>
       <w:r>
         <w:rPr>
           <w:sz w:val="24"/>
           <w:szCs w:val="24"/>
           <w:lang w:val="pt-BR"/>
         </w:rPr>
-        <w:t xml:space="preserve">{{ </w:t>
-      </w:r>
-      <w:proofErr w:type="spellStart"/>
-      <w:r>
-        <w:rPr>
-          <w:sz w:val="24"/>
-          <w:szCs w:val="24"/>
-          <w:lang w:val="pt-BR"/>
-        </w:rPr>
-        <w:t>detalhes</w:t>
-      </w:r>
-      <w:proofErr w:type="gramEnd"/>
-      <w:r>
-        <w:rPr>
-          <w:sz w:val="24"/>
-          <w:szCs w:val="24"/>
-          <w:lang w:val="pt-BR"/>
-        </w:rPr>
-        <w:t>_laudo</w:t>
-      </w:r>
-      <w:proofErr w:type="spellEnd"/>
-      <w:r>
-        <w:rPr>
-          <w:sz w:val="24"/>
-          <w:szCs w:val="24"/>
-          <w:lang w:val="pt-BR"/>
-        </w:rPr>
-        <w:t xml:space="preserve"> }}</w:t>
+        <w:t>{{ detalhes_laudo }}</w:t>
       </w:r>
     </w:p>
     <w:p>
@@ -2737,6 +2693,7 @@
           <w:rFonts w:ascii="Arial" w:hAnsi="Arial" w:cs="Arial"/>
           <w:noProof/>
         </w:rPr>
+        <w:lastRenderedPageBreak/>
         <mc:AlternateContent>
           <mc:Choice Requires="wps">
             <w:drawing>
@@ -2868,7 +2825,6 @@
           <w:sz w:val="24"/>
           <w:szCs w:val="24"/>
         </w:rPr>
-        <w:lastRenderedPageBreak/>
         <w:tab/>
         <w:t>Vejamos abaixo as documentações que corroboram com seu quadro clínico.</w:t>
       </w:r>
@@ -8407,7 +8363,7 @@
 </file>
 
 <file path=customXml/itemProps1.xml><?xml version="1.0" encoding="utf-8"?>
-<ds:datastoreItem xmlns:ds="http://schemas.openxmlformats.org/officeDocument/2006/customXml" ds:itemID="{72FFF9EC-85F4-4463-BE04-8E5F042113F4}">
+<ds:datastoreItem xmlns:ds="http://schemas.openxmlformats.org/officeDocument/2006/customXml" ds:itemID="{B8AD26A7-BA46-49B0-9DC9-FF03D7A92C3C}">
   <ds:schemaRefs>
     <ds:schemaRef ds:uri="http://schemas.openxmlformats.org/officeDocument/2006/bibliography"/>
   </ds:schemaRefs>

</xml_diff>